<commit_message>
feat: Integrar correcciones Entrega 3 y finalizar Entregables Portafolio 4 (LaTeX con BMC y Unit Economics corregidos, PPTX, XLSX y DOCX)
</commit_message>
<xml_diff>
--- a/01_Proyecto_Wheels_Externado/Entrega_3/Entrega_3_Equipo_5_Anexos.docx
+++ b/01_Proyecto_Wheels_Externado/Entrega_3/Entrega_3_Equipo_5_Anexos.docx
@@ -143,7 +143,7 @@
               <w:rPr>
                 <w:sz w:val="16"/>
               </w:rPr>
-              <w:t>Validar con 12 estudiantes de la Universidad Externado de Colombia (8 pasajeros y 4 conductores de Wheels) cómo gestionan hoy sus viajes al campus, quién y cómo decide el pago del trayecto, qué canales usan y qué relación esperan de una plataforma institucional, mediante entrevistas semiestructuradas realizadas entre el 17 y el 21 de octubre de 2026, para tomar la decisión de perseverar, ajustar o pivotar el prototipo antes del Trabajo de Campo 3.</w:t>
+              <w:t>Validar con 12 estudiantes de la Universidad Externado de Colombia (8 pasajeros y 4 conductores de Wheels) cómo gestionan hoy sus viajes al campus, quién y cómo decide el pago del trayecto, qué canales usan y qué relación esperan de una plataforma institucional, mediante entrevistas semiestructuradas realizadas entre el 17 y el 30 de octubre de 2026 (8 iniciales del 17 al 21 y 4 complementarias del 28 al 30), para tomar la decisión de perseverar, ajustar o pivotar el prototipo antes del Trabajo de Campo 3.</w:t>
             </w:r>
           </w:p>
         </w:tc>
@@ -208,6 +208,8 @@
               <w:t>H2 (Compra): Creemos que el pasajero decide y paga individualmente el Wheels, que la tarifa de referencia es $6.000 COP y que estaría dispuesto a pagar una prima por certeza y seguridad; el conductor amortiza costos fijos. Se valida si ≥9 de 12 lo describen así.</w:t>
               <w:br/>
               <w:t>H3 (Relación): Creemos que el usuario probaría una app institucional verificada (@uexternado.edu.co) si garantiza cupo, reputación y pagos digitales, y que daría un compromiso para el Campo 3. Se valida si ≥8 de 12 lo nombran como condición y ≥4 de 12 aceptan participar en la prueba.</w:t>
+              <w:br/>
+              <w:t>Criterio operativo del conteo: se contó como "condición" que la persona nombre al menos una de las condiciones del paquete (verificación institucional, cupo garantizado, reputación o pago digital); además se reporta aparte cuántas piden la verificación institucional de forma explícita.</w:t>
             </w:r>
           </w:p>
         </w:tc>
@@ -295,9 +297,9 @@
               <w:rPr>
                 <w:sz w:val="16"/>
               </w:rPr>
-              <w:t>Planeada: 10 pasajeros + 4 conductores (modelo de plataforma de dos lados: 8-10 lado demanda / 4-5 lado oferta).</w:t>
+              <w:t>Planeada: de 12 a 15 entrevistas (8-10 pasajeros y 4-5 conductores, el rango que propone la guía para plataformas de dos lados).</w:t>
               <w:br/>
-              <w:t>Lograda: 12 entrevistas válidas (8 pasajeros + 4 conductores). Brecha de 2 pasajeros asumida como limitación.</w:t>
+              <w:t>Lograda: 12 entrevistas válidas (8 pasajeros + 4 conductores), es decir, el mínimo del rango en ambos lados; no queda margen para descartar entrevistas.</w:t>
             </w:r>
           </w:p>
         </w:tc>
@@ -465,7 +467,7 @@
               <w:rPr>
                 <w:sz w:val="16"/>
               </w:rPr>
-              <w:t>1) Sin expertos de movilidad en el Campo 1 (correspondió a la idea anterior StatCredit AI por el pivote); las hipótesis parten de observación directa. 2) Consentimiento tardío en E1-E8 (remediado). 3) Reclutamiento por red de contactos universitaria: posible homogeneidad de respuestas. 4) N=12: resultados indiciarios, no estadísticamente representativos.</w:t>
+              <w:t>1) Sin expertos de movilidad en el Campo 1 (correspondió a la idea anterior StatCredit AI por el pivote); las hipótesis parten de observación directa. 2) Consentimiento tardío en E1-E8 (remediado). 3) Reclutamiento por red de contactos universitaria: posible homogeneidad de respuestas. 4) N=12: resultados indiciarios, no estadísticamente representativos. 5) El concepto se mostró a 4 de las 12 personas (E9-E12), por lo que la reacción al concepto es una señal inicial (n=4). 6) Las preguntas sobre quién influye y quién puede frenar la compra (tema 4) dieron poca evidencia; se profundizarán en el Campo 3.</w:t>
             </w:r>
           </w:p>
         </w:tc>
@@ -844,7 +846,7 @@
               </w:rPr>
               <w:t>15) Con tus palabras, ¿qué es esto y para quién crees que es? ¿Qué parte te serviría más y cuál te sobra? ¿Qué le falta?</w:t>
               <w:br/>
-              <w:t>16) Compromiso: En dos semanas vamos a probar un prototipo. ¿Te gustaría participar? ¿Qué día y medio te contactamos? Referido: ¿Conoces a alguien con tu misma situación que deberíamos entrevistar?</w:t>
+              <w:t>16) Compromiso: En dos semanas vamos a probar un prototipo. ¿Te gustaría participar? ¿Qué día y por qué medio te contactamos? Referido: ¿Conoces a alguien con tu misma situación que deberíamos entrevistar?</w:t>
             </w:r>
           </w:p>
         </w:tc>
@@ -880,7 +882,7 @@
       <w:r>
         <w:drawing>
           <wp:inline xmlns:a="http://schemas.openxmlformats.org/drawingml/2006/main" xmlns:pic="http://schemas.openxmlformats.org/drawingml/2006/picture">
-            <wp:extent cx="8686800" cy="6142181"/>
+            <wp:extent cx="6400800" cy="5511642"/>
             <wp:docPr id="1" name="Picture 1"/>
             <wp:cNvGraphicFramePr>
               <a:graphicFrameLocks noChangeAspect="1"/>
@@ -889,7 +891,7 @@
               <a:graphicData uri="http://schemas.openxmlformats.org/drawingml/2006/picture">
                 <pic:pic>
                   <pic:nvPicPr>
-                    <pic:cNvPr id="0" name="Concepto_Wheels.png"/>
+                    <pic:cNvPr id="0" name="Concepto_Wheels_completo.png"/>
                     <pic:cNvPicPr/>
                   </pic:nvPicPr>
                   <pic:blipFill>
@@ -901,7 +903,7 @@
                   <pic:spPr>
                     <a:xfrm>
                       <a:off x="0" y="0"/>
-                      <a:ext cx="8686800" cy="6142181"/>
+                      <a:ext cx="6400800" cy="5511642"/>
                     </a:xfrm>
                     <a:prstGeom prst="rect"/>
                   </pic:spPr>
@@ -919,7 +921,7 @@
           <w:i/>
           <w:sz w:val="21"/>
         </w:rPr>
-        <w:t>Nota: el concepto es easy de modificar; las observaciones de los clientes sobre "qué le falta" se registraron en el Anexo D y alimentan el backlog del prototipo del Campo 3.</w:t>
+        <w:t>Nota: el concepto es fácil de modificar; las observaciones de los clientes sobre "qué le falta" se registraron en el Anexo D y alimentan el backlog del prototipo del Campo 3.</w:t>
       </w:r>
     </w:p>
     <w:p>
@@ -945,7 +947,7 @@
           <w:i w:val="0"/>
           <w:sz w:val="21"/>
         </w:rPr>
-        <w:t>Una fila por persona entrevistada. Nombres reales omitidos por confidencialidad (Ley 1581 de 2012).</w:t>
+        <w:t>Una fila por persona entrevistada. Nombres reales omitidos por confidencialidad (Ley 1581 de 2012). Las celdas reflejan lo registrado en las transcripciones; "No registrado" significa que la transcripción no recoge ese dato.</w:t>
       </w:r>
     </w:p>
     <w:tbl>
@@ -1107,7 +1109,7 @@
                 <w:b/>
                 <w:sz w:val="16"/>
               </w:rPr>
-              <w:t>Relación preferida</w:t>
+              <w:t>Qué pidió / necesidad expresada</w:t>
             </w:r>
           </w:p>
         </w:tc>
@@ -1121,7 +1123,7 @@
                 <w:b/>
                 <w:sz w:val="16"/>
               </w:rPr>
-              <w:t>Reacción al concepto</w:t>
+              <w:t>Reacción al concepto (mostrado solo a E9-E12)</w:t>
             </w:r>
           </w:p>
         </w:tc>
@@ -1135,7 +1137,7 @@
                 <w:b/>
                 <w:sz w:val="16"/>
               </w:rPr>
-              <w:t>Compromiso</w:t>
+              <w:t>Compromiso Campo 3</w:t>
             </w:r>
           </w:p>
         </w:tc>
@@ -1216,7 +1218,7 @@
               <w:rPr>
                 <w:sz w:val="16"/>
               </w:rPr>
-              <w:t>Diaria</w:t>
+              <w:t>Habitual</w:t>
             </w:r>
           </w:p>
         </w:tc>
@@ -1229,7 +1231,7 @@
               <w:rPr>
                 <w:sz w:val="16"/>
               </w:rPr>
-              <w:t>$6.000/pasaje</w:t>
+              <w:t>$6.000/trayecto</w:t>
             </w:r>
           </w:p>
         </w:tc>
@@ -1242,7 +1244,7 @@
               <w:rPr>
                 <w:sz w:val="16"/>
               </w:rPr>
-              <w:t>Grupos WhatsApp</w:t>
+              <w:t>Grupos de WhatsApp</w:t>
             </w:r>
           </w:p>
         </w:tc>
@@ -1255,7 +1257,7 @@
               <w:rPr>
                 <w:sz w:val="16"/>
               </w:rPr>
-              <w:t>Él mismo (pago individual)</w:t>
+              <w:t>Paga él mismo</w:t>
             </w:r>
           </w:p>
         </w:tc>
@@ -1268,7 +1270,7 @@
               <w:rPr>
                 <w:sz w:val="16"/>
               </w:rPr>
-              <w:t>WhatsApp; pares de carrera</w:t>
+              <w:t>Grupos de WhatsApp</w:t>
             </w:r>
           </w:p>
         </w:tc>
@@ -1281,7 +1283,7 @@
               <w:rPr>
                 <w:sz w:val="16"/>
               </w:rPr>
-              <w:t>Cupo garantizado + GPS</w:t>
+              <w:t>Cupo garantizado + conductor verificado + seguimiento en tiempo real</w:t>
             </w:r>
           </w:p>
         </w:tc>
@@ -1294,7 +1296,7 @@
               <w:rPr>
                 <w:sz w:val="16"/>
               </w:rPr>
-              <w:t>Serviría: reserva y GPS. Sobra: nada. Falta: seguimiento en vivo.</w:t>
+              <w:t>No se mostró el concepto</w:t>
             </w:r>
           </w:p>
         </w:tc>
@@ -1307,7 +1309,7 @@
               <w:rPr>
                 <w:sz w:val="16"/>
               </w:rPr>
-              <w:t>Prueba prototipo (sí)</w:t>
+              <w:t>No registrado</w:t>
             </w:r>
           </w:p>
         </w:tc>
@@ -1387,7 +1389,7 @@
               <w:rPr>
                 <w:sz w:val="16"/>
               </w:rPr>
-              <w:t>Diaria</w:t>
+              <w:t>Todos los días</w:t>
             </w:r>
           </w:p>
         </w:tc>
@@ -1400,7 +1402,7 @@
               <w:rPr>
                 <w:sz w:val="16"/>
               </w:rPr>
-              <w:t>$6.000 (hoy)</w:t>
+              <w:t>$6.000 (pagaría hasta $10.000)</w:t>
             </w:r>
           </w:p>
         </w:tc>
@@ -1413,7 +1415,7 @@
               <w:rPr>
                 <w:sz w:val="16"/>
               </w:rPr>
-              <w:t>Grupos WhatsApp</w:t>
+              <w:t>Grupos de WhatsApp</w:t>
             </w:r>
           </w:p>
         </w:tc>
@@ -1426,7 +1428,7 @@
               <w:rPr>
                 <w:sz w:val="16"/>
               </w:rPr>
-              <w:t>Él mismo</w:t>
+              <w:t>Paga él mismo</w:t>
             </w:r>
           </w:p>
         </w:tc>
@@ -1439,7 +1441,7 @@
               <w:rPr>
                 <w:sz w:val="16"/>
               </w:rPr>
-              <w:t>WhatsApp; pares</w:t>
+              <w:t>Grupos de WhatsApp</w:t>
             </w:r>
           </w:p>
         </w:tc>
@@ -1452,7 +1454,7 @@
               <w:rPr>
                 <w:sz w:val="16"/>
               </w:rPr>
-              <w:t>Reserva fija + mapa de ruta</w:t>
+              <w:t>Reserva fija + ruta en mapa</w:t>
             </w:r>
           </w:p>
         </w:tc>
@@ -1465,7 +1467,7 @@
               <w:rPr>
                 <w:sz w:val="16"/>
               </w:rPr>
-              <w:t>Serviría: reserva fija y ruta en mapa.</w:t>
+              <w:t>No se mostró el concepto</w:t>
             </w:r>
           </w:p>
         </w:tc>
@@ -1478,7 +1480,7 @@
               <w:rPr>
                 <w:sz w:val="16"/>
               </w:rPr>
-              <w:t>Referido ofrecido</w:t>
+              <w:t>No registrado</w:t>
             </w:r>
           </w:p>
         </w:tc>
@@ -1558,7 +1560,7 @@
               <w:rPr>
                 <w:sz w:val="16"/>
               </w:rPr>
-              <w:t>3-4/semana</w:t>
+              <w:t>3-4 veces/semana</w:t>
             </w:r>
           </w:p>
         </w:tc>
@@ -1584,7 +1586,7 @@
               <w:rPr>
                 <w:sz w:val="16"/>
               </w:rPr>
-              <w:t>Grupos WhatsApp</w:t>
+              <w:t>Grupos de WhatsApp</w:t>
             </w:r>
           </w:p>
         </w:tc>
@@ -1597,7 +1599,7 @@
               <w:rPr>
                 <w:sz w:val="16"/>
               </w:rPr>
-              <w:t>Él mismo</w:t>
+              <w:t>Paga él mismo</w:t>
             </w:r>
           </w:p>
         </w:tc>
@@ -1610,7 +1612,7 @@
               <w:rPr>
                 <w:sz w:val="16"/>
               </w:rPr>
-              <w:t>WhatsApp; redes</w:t>
+              <w:t>Grupos de WhatsApp</w:t>
             </w:r>
           </w:p>
         </w:tc>
@@ -1623,7 +1625,7 @@
               <w:rPr>
                 <w:sz w:val="16"/>
               </w:rPr>
-              <w:t>Filtros por ruta/hora + pago digital</w:t>
+              <w:t>Filtros por ruta/hora + pago digital (Nequi/Daviplata)</w:t>
             </w:r>
           </w:p>
         </w:tc>
@@ -1636,7 +1638,7 @@
               <w:rPr>
                 <w:sz w:val="16"/>
               </w:rPr>
-              <w:t>Serviría: filtros. Falta: billetera integrada.</w:t>
+              <w:t>No se mostró el concepto</w:t>
             </w:r>
           </w:p>
         </w:tc>
@@ -1649,7 +1651,7 @@
               <w:rPr>
                 <w:sz w:val="16"/>
               </w:rPr>
-              <w:t>No compromiso explícito</w:t>
+              <w:t>No registrado</w:t>
             </w:r>
           </w:p>
         </w:tc>
@@ -1729,7 +1731,7 @@
               <w:rPr>
                 <w:sz w:val="16"/>
               </w:rPr>
-              <w:t>Diaria</w:t>
+              <w:t>Mañanas (no precisó)</w:t>
             </w:r>
           </w:p>
         </w:tc>
@@ -1742,7 +1744,7 @@
               <w:rPr>
                 <w:sz w:val="16"/>
               </w:rPr>
-              <w:t>$6.000</w:t>
+              <w:t>$6.000 (Uber de afán: $25.000-$30.000)</w:t>
             </w:r>
           </w:p>
         </w:tc>
@@ -1755,7 +1757,7 @@
               <w:rPr>
                 <w:sz w:val="16"/>
               </w:rPr>
-              <w:t>Grupos WhatsApp</w:t>
+              <w:t>Grupos de WhatsApp</w:t>
             </w:r>
           </w:p>
         </w:tc>
@@ -1768,7 +1770,7 @@
               <w:rPr>
                 <w:sz w:val="16"/>
               </w:rPr>
-              <w:t>Él mismo</w:t>
+              <w:t>Paga él mismo</w:t>
             </w:r>
           </w:p>
         </w:tc>
@@ -1781,7 +1783,7 @@
               <w:rPr>
                 <w:sz w:val="16"/>
               </w:rPr>
-              <w:t>WhatsApp</w:t>
+              <w:t>Grupos de WhatsApp</w:t>
             </w:r>
           </w:p>
         </w:tc>
@@ -1794,7 +1796,7 @@
               <w:rPr>
                 <w:sz w:val="16"/>
               </w:rPr>
-              <w:t>GPS en tiempo real</w:t>
+              <w:t>GPS en tiempo real + puntualidad</w:t>
             </w:r>
           </w:p>
         </w:tc>
@@ -1807,7 +1809,7 @@
               <w:rPr>
                 <w:sz w:val="16"/>
               </w:rPr>
-              <w:t>Serviría: GPS. Falta: nada.</w:t>
+              <w:t>No se mostró el concepto</w:t>
             </w:r>
           </w:p>
         </w:tc>
@@ -1820,7 +1822,7 @@
               <w:rPr>
                 <w:sz w:val="16"/>
               </w:rPr>
-              <w:t>Referido ofrecido</w:t>
+              <w:t>No registrado</w:t>
             </w:r>
           </w:p>
         </w:tc>
@@ -1900,7 +1902,7 @@
               <w:rPr>
                 <w:sz w:val="16"/>
               </w:rPr>
-              <w:t>Diaria</w:t>
+              <w:t>Habitual</w:t>
             </w:r>
           </w:p>
         </w:tc>
@@ -1913,7 +1915,7 @@
               <w:rPr>
                 <w:sz w:val="16"/>
               </w:rPr>
-              <w:t>$6.000×3 cupos</w:t>
+              <w:t>$6.000 x 3 cupos</w:t>
             </w:r>
           </w:p>
         </w:tc>
@@ -1939,7 +1941,7 @@
               <w:rPr>
                 <w:sz w:val="16"/>
               </w:rPr>
-              <w:t>Él (oferta)</w:t>
+              <w:t>Fija la tarifa del grupo</w:t>
             </w:r>
           </w:p>
         </w:tc>
@@ -1952,7 +1954,7 @@
               <w:rPr>
                 <w:sz w:val="16"/>
               </w:rPr>
-              <w:t>WhatsApp (4 grupos)</w:t>
+              <w:t>Grupos de WhatsApp (4)</w:t>
             </w:r>
           </w:p>
         </w:tc>
@@ -1965,7 +1967,7 @@
               <w:rPr>
                 <w:sz w:val="16"/>
               </w:rPr>
-              <w:t>Verificación + reserva + penalización</w:t>
+              <w:t>Verificación institucional + reserva formal + penalización + pago centralizado</w:t>
             </w:r>
           </w:p>
         </w:tc>
@@ -1978,7 +1980,7 @@
               <w:rPr>
                 <w:sz w:val="16"/>
               </w:rPr>
-              <w:t>Serviría: verificación y reservas.</w:t>
+              <w:t>No se mostró el concepto</w:t>
             </w:r>
           </w:p>
         </w:tc>
@@ -1991,7 +1993,7 @@
               <w:rPr>
                 <w:sz w:val="16"/>
               </w:rPr>
-              <w:t>Prueba como conductor</w:t>
+              <w:t>No registrado</w:t>
             </w:r>
           </w:p>
         </w:tc>
@@ -2071,7 +2073,7 @@
               <w:rPr>
                 <w:sz w:val="16"/>
               </w:rPr>
-              <w:t>Diaria</w:t>
+              <w:t>Todos los días</w:t>
             </w:r>
           </w:p>
         </w:tc>
@@ -2084,7 +2086,7 @@
               <w:rPr>
                 <w:sz w:val="16"/>
               </w:rPr>
-              <w:t>$6.000 (hasta $15k en parciales)</w:t>
+              <w:t>$6.000 (hasta $15.000 en parciales)</w:t>
             </w:r>
           </w:p>
         </w:tc>
@@ -2097,7 +2099,7 @@
               <w:rPr>
                 <w:sz w:val="16"/>
               </w:rPr>
-              <w:t>Flota + conexión con Wheels</w:t>
+              <w:t>Flota intermunicipal + Wheels de compañeros</w:t>
             </w:r>
           </w:p>
         </w:tc>
@@ -2110,7 +2112,7 @@
               <w:rPr>
                 <w:sz w:val="16"/>
               </w:rPr>
-              <w:t>Él mismo</w:t>
+              <w:t>Paga él mismo</w:t>
             </w:r>
           </w:p>
         </w:tc>
@@ -2123,7 +2125,7 @@
               <w:rPr>
                 <w:sz w:val="16"/>
               </w:rPr>
-              <w:t>WhatsApp; pares</w:t>
+              <w:t>Compañeros con carro</w:t>
             </w:r>
           </w:p>
         </w:tc>
@@ -2136,7 +2138,7 @@
               <w:rPr>
                 <w:sz w:val="16"/>
               </w:rPr>
-              <w:t>Paradas intermedias + llegada en vivo</w:t>
+              <w:t>Paradas intermedias + llegada en vivo + cupo garantizado</w:t>
             </w:r>
           </w:p>
         </w:tc>
@@ -2149,7 +2151,7 @@
               <w:rPr>
                 <w:sz w:val="16"/>
               </w:rPr>
-              <w:t>Serviría: llegada en vivo. Falta: paradas intermedias.</w:t>
+              <w:t>No se mostró el concepto</w:t>
             </w:r>
           </w:p>
         </w:tc>
@@ -2162,7 +2164,7 @@
               <w:rPr>
                 <w:sz w:val="16"/>
               </w:rPr>
-              <w:t>Prueba prototipo</w:t>
+              <w:t>No registrado</w:t>
             </w:r>
           </w:p>
         </w:tc>
@@ -2242,7 +2244,7 @@
               <w:rPr>
                 <w:sz w:val="16"/>
               </w:rPr>
-              <w:t>Diaria</w:t>
+              <w:t>Todos los días</w:t>
             </w:r>
           </w:p>
         </w:tc>
@@ -2255,7 +2257,7 @@
               <w:rPr>
                 <w:sz w:val="16"/>
               </w:rPr>
-              <w:t>$6.000×4 cupos</w:t>
+              <w:t>$6.000 x 4 cupos</w:t>
             </w:r>
           </w:p>
         </w:tc>
@@ -2281,7 +2283,7 @@
               <w:rPr>
                 <w:sz w:val="16"/>
               </w:rPr>
-              <w:t>Él (oferta)</w:t>
+              <w:t>Fija la tarifa del grupo</w:t>
             </w:r>
           </w:p>
         </w:tc>
@@ -2294,7 +2296,7 @@
               <w:rPr>
                 <w:sz w:val="16"/>
               </w:rPr>
-              <w:t>WhatsApp (4 grupos)</w:t>
+              <w:t>Grupos de WhatsApp (4)</w:t>
             </w:r>
           </w:p>
         </w:tc>
@@ -2307,7 +2309,7 @@
               <w:rPr>
                 <w:sz w:val="16"/>
               </w:rPr>
-              <w:t>Abono de reserva + puntuación + chatbot</w:t>
+              <w:t>Abono/depósito de reserva + puntuación + chatbot</w:t>
             </w:r>
           </w:p>
         </w:tc>
@@ -2320,7 +2322,7 @@
               <w:rPr>
                 <w:sz w:val="16"/>
               </w:rPr>
-              <w:t>Serviría: depósito de $2.000 de reserva.</w:t>
+              <w:t>No se mostró el concepto</w:t>
             </w:r>
           </w:p>
         </w:tc>
@@ -2333,7 +2335,7 @@
               <w:rPr>
                 <w:sz w:val="16"/>
               </w:rPr>
-              <w:t>Prueba como conductor</w:t>
+              <w:t>No registrado</w:t>
             </w:r>
           </w:p>
         </w:tc>
@@ -2413,7 +2415,7 @@
               <w:rPr>
                 <w:sz w:val="16"/>
               </w:rPr>
-              <w:t>Tardes/noches</w:t>
+              <w:t>Regreso en tardes/noches</w:t>
             </w:r>
           </w:p>
         </w:tc>
@@ -2439,7 +2441,7 @@
               <w:rPr>
                 <w:sz w:val="16"/>
               </w:rPr>
-              <w:t>Grupos WhatsApp</w:t>
+              <w:t>Grupos de WhatsApp</w:t>
             </w:r>
           </w:p>
         </w:tc>
@@ -2452,7 +2454,7 @@
               <w:rPr>
                 <w:sz w:val="16"/>
               </w:rPr>
-              <w:t>Él mismo</w:t>
+              <w:t>Paga él mismo</w:t>
             </w:r>
           </w:p>
         </w:tc>
@@ -2465,7 +2467,7 @@
               <w:rPr>
                 <w:sz w:val="16"/>
               </w:rPr>
-              <w:t>WhatsApp; pares</w:t>
+              <w:t>Grupos de WhatsApp</w:t>
             </w:r>
           </w:p>
         </w:tc>
@@ -2478,7 +2480,7 @@
               <w:rPr>
                 <w:sz w:val="16"/>
               </w:rPr>
-              <w:t>Verificación estricta + botón de pánico + reseñas</w:t>
+              <w:t>Validación de identidad institucional + botón de pánico + reseñas + atención humana</w:t>
             </w:r>
           </w:p>
         </w:tc>
@@ -2491,7 +2493,7 @@
               <w:rPr>
                 <w:sz w:val="16"/>
               </w:rPr>
-              <w:t>Serviría: verificación y reporte. Falta: atención humana.</w:t>
+              <w:t>No se mostró el concepto</w:t>
             </w:r>
           </w:p>
         </w:tc>
@@ -2504,7 +2506,7 @@
               <w:rPr>
                 <w:sz w:val="16"/>
               </w:rPr>
-              <w:t>Referido ofrecido</w:t>
+              <w:t>No registrado</w:t>
             </w:r>
           </w:p>
         </w:tc>
@@ -2584,7 +2586,7 @@
               <w:rPr>
                 <w:sz w:val="16"/>
               </w:rPr>
-              <w:t>Diaria</w:t>
+              <w:t>Habitual (prácticas en la mañana)</w:t>
             </w:r>
           </w:p>
         </w:tc>
@@ -2610,7 +2612,7 @@
               <w:rPr>
                 <w:sz w:val="16"/>
               </w:rPr>
-              <w:t>Grupos WhatsApp</w:t>
+              <w:t>Grupos de WhatsApp</w:t>
             </w:r>
           </w:p>
         </w:tc>
@@ -2623,7 +2625,7 @@
               <w:rPr>
                 <w:sz w:val="16"/>
               </w:rPr>
-              <w:t>Ella misma</w:t>
+              <w:t>Paga ella misma</w:t>
             </w:r>
           </w:p>
         </w:tc>
@@ -2636,7 +2638,7 @@
               <w:rPr>
                 <w:sz w:val="16"/>
               </w:rPr>
-              <w:t>WhatsApp; pares; familia</w:t>
+              <w:t>Grupos de WhatsApp</w:t>
             </w:r>
           </w:p>
         </w:tc>
@@ -2649,7 +2651,7 @@
               <w:rPr>
                 <w:sz w:val="16"/>
               </w:rPr>
-              <w:t>Verificación + viaje en vivo con familia + género visible</w:t>
+              <w:t>Conductor verificado + viaje en vivo con la familia + género visible</w:t>
             </w:r>
           </w:p>
         </w:tc>
@@ -2662,7 +2664,7 @@
               <w:rPr>
                 <w:sz w:val="16"/>
               </w:rPr>
-              <w:t>Serviría: viaje en vivo. Falta: filtro conductoras mujeres.</w:t>
+              <w:t>Sirve: viaje en vivo y calificaciones. Falta: filtro de conductoras mujeres. Sobra: nada.</w:t>
             </w:r>
           </w:p>
         </w:tc>
@@ -2675,7 +2677,7 @@
               <w:rPr>
                 <w:sz w:val="16"/>
               </w:rPr>
-              <w:t>Prueba prototipo + referido (Timiza)</w:t>
+              <w:t>Acepta probar el prototipo + referido (Timiza)</w:t>
             </w:r>
           </w:p>
         </w:tc>
@@ -2755,7 +2757,7 @@
               <w:rPr>
                 <w:sz w:val="16"/>
               </w:rPr>
-              <w:t>3/semana</w:t>
+              <w:t>3 veces/semana</w:t>
             </w:r>
           </w:p>
         </w:tc>
@@ -2781,7 +2783,7 @@
               <w:rPr>
                 <w:sz w:val="16"/>
               </w:rPr>
-              <w:t>Grupos WhatsApp</w:t>
+              <w:t>Grupos de WhatsApp</w:t>
             </w:r>
           </w:p>
         </w:tc>
@@ -2794,7 +2796,7 @@
               <w:rPr>
                 <w:sz w:val="16"/>
               </w:rPr>
-              <w:t>Él mismo</w:t>
+              <w:t>Paga él mismo</w:t>
             </w:r>
           </w:p>
         </w:tc>
@@ -2807,7 +2809,7 @@
               <w:rPr>
                 <w:sz w:val="16"/>
               </w:rPr>
-              <w:t>WhatsApp; pares</w:t>
+              <w:t>Grupos de WhatsApp</w:t>
             </w:r>
           </w:p>
         </w:tc>
@@ -2820,7 +2822,7 @@
               <w:rPr>
                 <w:sz w:val="16"/>
               </w:rPr>
-              <w:t>Filtros + pago digital + calendario</w:t>
+              <w:t>Filtros por ruta/horario + pago digital + calendario</w:t>
             </w:r>
           </w:p>
         </w:tc>
@@ -2833,7 +2835,7 @@
               <w:rPr>
                 <w:sz w:val="16"/>
               </w:rPr>
-              <w:t>Serviría: filtros. Sobra: calibración obligatoria. Falta: calendario.</w:t>
+              <w:t>Sirve: filtros y pago automático. Sobra: calificación obligatoria en cada viaje. Falta: calendario.</w:t>
             </w:r>
           </w:p>
         </w:tc>
@@ -2846,7 +2848,7 @@
               <w:rPr>
                 <w:sz w:val="16"/>
               </w:rPr>
-              <w:t>Prueba prototipo</w:t>
+              <w:t>Acepta probar el prototipo + referido (Suba)</w:t>
             </w:r>
           </w:p>
         </w:tc>
@@ -2926,7 +2928,7 @@
               <w:rPr>
                 <w:sz w:val="16"/>
               </w:rPr>
-              <w:t>Diaria</w:t>
+              <w:t>Habitual (3 pasajeras fijas)</w:t>
             </w:r>
           </w:p>
         </w:tc>
@@ -2939,7 +2941,7 @@
               <w:rPr>
                 <w:sz w:val="16"/>
               </w:rPr>
-              <w:t>$6.000×3 cupos</w:t>
+              <w:t>$6.000 x 3 cupos</w:t>
             </w:r>
           </w:p>
         </w:tc>
@@ -2965,7 +2967,7 @@
               <w:rPr>
                 <w:sz w:val="16"/>
               </w:rPr>
-              <w:t>Ella (oferta)</w:t>
+              <w:t>Fija la tarifa del grupo</w:t>
             </w:r>
           </w:p>
         </w:tc>
@@ -2978,7 +2980,7 @@
               <w:rPr>
                 <w:sz w:val="16"/>
               </w:rPr>
-              <w:t>WhatsApp; pares</w:t>
+              <w:t>Grupos de WhatsApp</w:t>
             </w:r>
           </w:p>
         </w:tc>
@@ -2991,7 +2993,7 @@
               <w:rPr>
                 <w:sz w:val="16"/>
               </w:rPr>
-              <w:t>Verificación + pago inmediato + historial visible</w:t>
+              <w:t>Correo institucional + calificaciones + pago inmediato + soporte</w:t>
             </w:r>
           </w:p>
         </w:tc>
@@ -3004,7 +3006,7 @@
               <w:rPr>
                 <w:sz w:val="16"/>
               </w:rPr>
-              <w:t>Serviría: pago inmediato. Sobra: botón de pánico. Falta: historial.</w:t>
+              <w:t>Sirve: pago centralizado y calificaciones. Sobra: botón de pánico si hay soporte humano. Falta: historial del conductor.</w:t>
             </w:r>
           </w:p>
         </w:tc>
@@ -3017,7 +3019,7 @@
               <w:rPr>
                 <w:sz w:val="16"/>
               </w:rPr>
-              <w:t>Prueba como conductora + referido (Portal Sur)</w:t>
+              <w:t>Acepta probar como conductora + referido (Portal Sur)</w:t>
             </w:r>
           </w:p>
         </w:tc>
@@ -3097,7 +3099,7 @@
               <w:rPr>
                 <w:sz w:val="16"/>
               </w:rPr>
-              <w:t>Diaria</w:t>
+              <w:t>Todos los días</w:t>
             </w:r>
           </w:p>
         </w:tc>
@@ -3110,7 +3112,7 @@
               <w:rPr>
                 <w:sz w:val="16"/>
               </w:rPr>
-              <w:t>$6.000×4 cupos</w:t>
+              <w:t>$6.000 x 4 cupos</w:t>
             </w:r>
           </w:p>
         </w:tc>
@@ -3136,7 +3138,7 @@
               <w:rPr>
                 <w:sz w:val="16"/>
               </w:rPr>
-              <w:t>Él (oferta)</w:t>
+              <w:t>Fija la tarifa del grupo</w:t>
             </w:r>
           </w:p>
         </w:tc>
@@ -3149,7 +3151,7 @@
               <w:rPr>
                 <w:sz w:val="16"/>
               </w:rPr>
-              <w:t>WhatsApp; pares</w:t>
+              <w:t>Grupos de WhatsApp</w:t>
             </w:r>
           </w:p>
         </w:tc>
@@ -3162,7 +3164,7 @@
               <w:rPr>
                 <w:sz w:val="16"/>
               </w:rPr>
-              <w:t>Reserva con abono + calificaciones + control de cupos</w:t>
+              <w:t>Reserva con abono/penalización + calificaciones + pago centralizado</w:t>
             </w:r>
           </w:p>
         </w:tc>
@@ -3175,7 +3177,7 @@
               <w:rPr>
                 <w:sz w:val="16"/>
               </w:rPr>
-              <w:t>Serviría: reserva con penalización. Falta: control de cupos y avisos.</w:t>
+              <w:t>Sirve: reserva con penalización y pago centralizado. Falta: control de cupos y avisos de cancelación.</w:t>
             </w:r>
           </w:p>
         </w:tc>
@@ -3188,7 +3190,7 @@
               <w:rPr>
                 <w:sz w:val="16"/>
               </w:rPr>
-              <w:t>Prueba como conductor + referido (Kennedy)</w:t>
+              <w:t>Acepta probar con sus rutas de la Calle 26 + referido (Kennedy)</w:t>
             </w:r>
           </w:p>
         </w:tc>
@@ -3614,48 +3616,17 @@
           </w:p>
         </w:tc>
       </w:tr>
-      <w:tr>
-        <w:tc>
-          <w:tcPr>
-            <w:tcW w:type="dxa" w:w="4713"/>
-          </w:tcPr>
-          <w:p>
-            <w:r>
-              <w:rPr>
-                <w:sz w:val="16"/>
-              </w:rPr>
-              <w:t>E2, E4, E6, E8</w:t>
-            </w:r>
-          </w:p>
-        </w:tc>
-        <w:tc>
-          <w:tcPr>
-            <w:tcW w:type="dxa" w:w="4713"/>
-          </w:tcPr>
-          <w:p>
-            <w:r>
-              <w:rPr>
-                <w:sz w:val="16"/>
-              </w:rPr>
-              <w:t>Prueba del prototipo y/o referido ofrecido en la entrevista.</w:t>
-            </w:r>
-          </w:p>
-        </w:tc>
-        <w:tc>
-          <w:tcPr>
-            <w:tcW w:type="dxa" w:w="4713"/>
-          </w:tcPr>
-          <w:p>
-            <w:r>
-              <w:rPr>
-                <w:sz w:val="16"/>
-              </w:rPr>
-              <w:t>Registro de entrevista (Anexo D)</w:t>
-            </w:r>
-          </w:p>
-        </w:tc>
-      </w:tr>
     </w:tbl>
+    <w:p>
+      <w:r>
+        <w:rPr>
+          <w:b w:val="0"/>
+          <w:i/>
+          <w:sz w:val="21"/>
+        </w:rPr>
+        <w:t>Resumen: 4 de 12 personas (E9-E12) aceptaron participar en la prueba del prototipo y entregaron un referido (4 referidos en total, aún sin contactar). En E1-E8 la transcripción no registra solicitud de compromiso ni referido.</w:t>
+      </w:r>
+    </w:p>
     <w:p>
       <w:r>
         <w:rPr>

</xml_diff>